<commit_message>
Fix Chapter 12 endocrine callout formatting
</commit_message>
<xml_diff>
--- a/public/chapter-12/Chapitre_12_Pancreas_version_complete_zones_reflexes_revisees.docx
+++ b/public/chapter-12/Chapitre_12_Pancreas_version_complete_zones_reflexes_revisees.docx
@@ -120,7 +120,21 @@
         <w:rPr>
           <w:lang w:val="fr-FR"/>
         </w:rPr>
-        <w:t>Le pancréas est sous-diaphragmatique et rétro-péritonéal.</w:t>
+        <w:t xml:space="preserve">Le pancréas est sous-diaphragmatique et </w:t>
+      </w:r>
+      <w:proofErr w:type="spellStart"/>
+      <w:r>
+        <w:rPr>
+          <w:lang w:val="fr-FR"/>
+        </w:rPr>
+        <w:t>rétro-péritonéal</w:t>
+      </w:r>
+      <w:proofErr w:type="spellEnd"/>
+      <w:r>
+        <w:rPr>
+          <w:lang w:val="fr-FR"/>
+        </w:rPr>
+        <w:t>.</w:t>
       </w:r>
     </w:p>
     <w:p>
@@ -265,7 +279,21 @@
         <w:rPr>
           <w:lang w:val="fr-FR"/>
         </w:rPr>
-        <w:t>Sa partie inférieure, située à droite des vaisseaux mésentériques supérieurs, forme un crochet : le processus uncinatus.</w:t>
+        <w:t xml:space="preserve">Sa partie inférieure, située à droite des vaisseaux mésentériques supérieurs, forme un crochet : le processus </w:t>
+      </w:r>
+      <w:proofErr w:type="spellStart"/>
+      <w:r>
+        <w:rPr>
+          <w:lang w:val="fr-FR"/>
+        </w:rPr>
+        <w:t>uncinatus</w:t>
+      </w:r>
+      <w:proofErr w:type="spellEnd"/>
+      <w:r>
+        <w:rPr>
+          <w:lang w:val="fr-FR"/>
+        </w:rPr>
+        <w:t>.</w:t>
       </w:r>
     </w:p>
     <w:p>
@@ -479,7 +507,21 @@
         <w:rPr>
           <w:lang w:val="fr-FR"/>
         </w:rPr>
-        <w:t>Les deux débouchent ensemble dans la papille duodénale majeure, ou ampoule hépato-pancréatique de Vater, à la jonction des 2/3 supérieurs et du 1/3 inférieur du 2ème duodénum, par la grande caroncule.</w:t>
+        <w:t xml:space="preserve">Les deux débouchent ensemble dans la papille duodénale majeure, ou ampoule </w:t>
+      </w:r>
+      <w:proofErr w:type="spellStart"/>
+      <w:r>
+        <w:rPr>
+          <w:lang w:val="fr-FR"/>
+        </w:rPr>
+        <w:t>hépato-pancréatique</w:t>
+      </w:r>
+      <w:proofErr w:type="spellEnd"/>
+      <w:r>
+        <w:rPr>
+          <w:lang w:val="fr-FR"/>
+        </w:rPr>
+        <w:t xml:space="preserve"> de Vater, à la jonction des 2/3 supérieurs et du 1/3 inférieur du 2ème duodénum, par la grande caroncule.</w:t>
       </w:r>
     </w:p>
     <w:p>
@@ -506,7 +548,21 @@
         <w:rPr>
           <w:lang w:val="fr-FR"/>
         </w:rPr>
-        <w:t>3.5.2. Canal pancréatique accessoire (canal de Santorini)</w:t>
+        <w:t xml:space="preserve">3.5.2. Canal pancréatique accessoire (canal de </w:t>
+      </w:r>
+      <w:proofErr w:type="spellStart"/>
+      <w:r>
+        <w:rPr>
+          <w:lang w:val="fr-FR"/>
+        </w:rPr>
+        <w:t>Santorini</w:t>
+      </w:r>
+      <w:proofErr w:type="spellEnd"/>
+      <w:r>
+        <w:rPr>
+          <w:lang w:val="fr-FR"/>
+        </w:rPr>
+        <w:t>)</w:t>
       </w:r>
     </w:p>
     <w:p>
@@ -641,8 +697,30 @@
         <w:rPr>
           <w:lang w:val="fr-FR"/>
         </w:rPr>
-        <w:t>3.6.4. Effet turgor et pressions intracavitaires</w:t>
-      </w:r>
+        <w:t xml:space="preserve">3.6.4. Effet </w:t>
+      </w:r>
+      <w:proofErr w:type="spellStart"/>
+      <w:r>
+        <w:rPr>
+          <w:lang w:val="fr-FR"/>
+        </w:rPr>
+        <w:t>turgor</w:t>
+      </w:r>
+      <w:proofErr w:type="spellEnd"/>
+      <w:r>
+        <w:rPr>
+          <w:lang w:val="fr-FR"/>
+        </w:rPr>
+        <w:t xml:space="preserve"> et pressions </w:t>
+      </w:r>
+      <w:proofErr w:type="spellStart"/>
+      <w:r>
+        <w:rPr>
+          <w:lang w:val="fr-FR"/>
+        </w:rPr>
+        <w:t>intracavitaires</w:t>
+      </w:r>
+      <w:proofErr w:type="spellEnd"/>
     </w:p>
     <w:p>
       <w:pPr>
@@ -695,7 +773,21 @@
         <w:rPr>
           <w:lang w:val="fr-FR"/>
         </w:rPr>
-        <w:t>Avec le 2ème duodénum dans le quadrilatère de Rogié.</w:t>
+        <w:t xml:space="preserve">Avec le 2ème duodénum dans le quadrilatère de </w:t>
+      </w:r>
+      <w:proofErr w:type="spellStart"/>
+      <w:r>
+        <w:rPr>
+          <w:lang w:val="fr-FR"/>
+        </w:rPr>
+        <w:t>Rogié</w:t>
+      </w:r>
+      <w:proofErr w:type="spellEnd"/>
+      <w:r>
+        <w:rPr>
+          <w:lang w:val="fr-FR"/>
+        </w:rPr>
+        <w:t>.</w:t>
       </w:r>
     </w:p>
     <w:p>
@@ -830,7 +922,21 @@
         <w:rPr>
           <w:lang w:val="fr-FR"/>
         </w:rPr>
-        <w:t>(figure 12.3)</w:t>
+        <w:t>(</w:t>
+      </w:r>
+      <w:proofErr w:type="gramStart"/>
+      <w:r>
+        <w:rPr>
+          <w:lang w:val="fr-FR"/>
+        </w:rPr>
+        <w:t>figure</w:t>
+      </w:r>
+      <w:proofErr w:type="gramEnd"/>
+      <w:r>
+        <w:rPr>
+          <w:lang w:val="fr-FR"/>
+        </w:rPr>
+        <w:t xml:space="preserve"> 12.3)</w:t>
       </w:r>
     </w:p>
     <w:p>
@@ -1533,7 +1639,35 @@
         <w:rPr>
           <w:lang w:val="fr-FR"/>
         </w:rPr>
-        <w:t>Elle met en jeu le pancréas, le foie, les reins, l’intestin et son microbiote, ainsi que l’axe hypothalamo-hypophyso-surrénalien, ou axe HHS, impliqué dans la réponse au stress.</w:t>
+        <w:t xml:space="preserve">Elle met en jeu le pancréas, le foie, les reins, l’intestin et son microbiote, ainsi que l’axe </w:t>
+      </w:r>
+      <w:proofErr w:type="spellStart"/>
+      <w:r>
+        <w:rPr>
+          <w:lang w:val="fr-FR"/>
+        </w:rPr>
+        <w:t>hypothalamo</w:t>
+      </w:r>
+      <w:proofErr w:type="spellEnd"/>
+      <w:r>
+        <w:rPr>
+          <w:lang w:val="fr-FR"/>
+        </w:rPr>
+        <w:t>-</w:t>
+      </w:r>
+      <w:proofErr w:type="spellStart"/>
+      <w:r>
+        <w:rPr>
+          <w:lang w:val="fr-FR"/>
+        </w:rPr>
+        <w:t>hypophyso</w:t>
+      </w:r>
+      <w:proofErr w:type="spellEnd"/>
+      <w:r>
+        <w:rPr>
+          <w:lang w:val="fr-FR"/>
+        </w:rPr>
+        <w:t>-surrénalien, ou axe HHS, impliqué dans la réponse au stress.</w:t>
       </w:r>
     </w:p>
     <w:p>
@@ -1694,7 +1828,35 @@
         <w:rPr>
           <w:lang w:val="fr-FR"/>
         </w:rPr>
-        <w:t>Sous l’action de l’axe hypothalamo-hypophyso-surrénalien, l’adrénaline sécrétée par la médullo-surrénale contribue à l’élévation de la glycémie en situation de stress.</w:t>
+        <w:t xml:space="preserve">Sous l’action de l’axe </w:t>
+      </w:r>
+      <w:proofErr w:type="spellStart"/>
+      <w:r>
+        <w:rPr>
+          <w:lang w:val="fr-FR"/>
+        </w:rPr>
+        <w:t>hypothalamo</w:t>
+      </w:r>
+      <w:proofErr w:type="spellEnd"/>
+      <w:r>
+        <w:rPr>
+          <w:lang w:val="fr-FR"/>
+        </w:rPr>
+        <w:t>-</w:t>
+      </w:r>
+      <w:proofErr w:type="spellStart"/>
+      <w:r>
+        <w:rPr>
+          <w:lang w:val="fr-FR"/>
+        </w:rPr>
+        <w:t>hypophyso</w:t>
+      </w:r>
+      <w:proofErr w:type="spellEnd"/>
+      <w:r>
+        <w:rPr>
+          <w:lang w:val="fr-FR"/>
+        </w:rPr>
+        <w:t>-surrénalien, l’adrénaline sécrétée par la médullo-surrénale contribue à l’élévation de la glycémie en situation de stress.</w:t>
       </w:r>
     </w:p>
     <w:p>
@@ -2093,7 +2255,21 @@
         <w:rPr>
           <w:lang w:val="fr-FR"/>
         </w:rPr>
-        <w:t>Les symptômes qui doivent nous alerter sur une possible gravité sont :</w:t>
+        <w:t xml:space="preserve">Les symptômes qui doivent nous alerter sur </w:t>
+      </w:r>
+      <w:proofErr w:type="gramStart"/>
+      <w:r>
+        <w:rPr>
+          <w:lang w:val="fr-FR"/>
+        </w:rPr>
+        <w:t>une possible gravité</w:t>
+      </w:r>
+      <w:proofErr w:type="gramEnd"/>
+      <w:r>
+        <w:rPr>
+          <w:lang w:val="fr-FR"/>
+        </w:rPr>
+        <w:t xml:space="preserve"> sont :</w:t>
       </w:r>
     </w:p>
     <w:p>
@@ -2311,7 +2487,23 @@
           <w:b/>
           <w:lang w:val="fr-FR"/>
         </w:rPr>
-        <w:t xml:space="preserve">Diabète insulino-résistant de type 2 de l’adulte : </w:t>
+        <w:t xml:space="preserve">Diabète </w:t>
+      </w:r>
+      <w:proofErr w:type="spellStart"/>
+      <w:r>
+        <w:rPr>
+          <w:b/>
+          <w:lang w:val="fr-FR"/>
+        </w:rPr>
+        <w:t>insulino</w:t>
+      </w:r>
+      <w:proofErr w:type="spellEnd"/>
+      <w:r>
+        <w:rPr>
+          <w:b/>
+          <w:lang w:val="fr-FR"/>
+        </w:rPr>
+        <w:t xml:space="preserve">-résistant de type 2 de l’adulte : </w:t>
       </w:r>
       <w:r>
         <w:rPr>
@@ -2540,6 +2732,13 @@
           <w:lang w:val="fr-FR"/>
         </w:rPr>
       </w:pPr>
+    </w:p>
+    <w:p>
+      <w:pPr>
+        <w:rPr>
+          <w:lang w:val="fr-FR"/>
+        </w:rPr>
+      </w:pPr>
       <w:r>
         <w:rPr>
           <w:b/>
@@ -2947,11 +3146,40 @@
           <w:lang w:val="fr-FR"/>
         </w:rPr>
       </w:pPr>
-      <w:r>
-        <w:rPr>
-          <w:lang w:val="fr-FR"/>
-        </w:rPr>
-        <w:t>Hyperinsulinémie et hypoinsulinémie.</w:t>
+    </w:p>
+    <w:p>
+      <w:pPr>
+        <w:rPr>
+          <w:lang w:val="fr-FR"/>
+        </w:rPr>
+      </w:pPr>
+      <w:proofErr w:type="spellStart"/>
+      <w:r>
+        <w:rPr>
+          <w:lang w:val="fr-FR"/>
+        </w:rPr>
+        <w:t>Hyperinsulinémie</w:t>
+      </w:r>
+      <w:proofErr w:type="spellEnd"/>
+      <w:r>
+        <w:rPr>
+          <w:lang w:val="fr-FR"/>
+        </w:rPr>
+        <w:t xml:space="preserve"> et </w:t>
+      </w:r>
+      <w:proofErr w:type="spellStart"/>
+      <w:r>
+        <w:rPr>
+          <w:lang w:val="fr-FR"/>
+        </w:rPr>
+        <w:t>hypoinsulinémie</w:t>
+      </w:r>
+      <w:proofErr w:type="spellEnd"/>
+      <w:r>
+        <w:rPr>
+          <w:lang w:val="fr-FR"/>
+        </w:rPr>
+        <w:t>.</w:t>
       </w:r>
     </w:p>
     <w:p>
@@ -3095,7 +3323,21 @@
         <w:rPr>
           <w:lang w:val="fr-FR"/>
         </w:rPr>
-        <w:t>11. Relations viscéro-somatiques</w:t>
+        <w:t xml:space="preserve">11. Relations </w:t>
+      </w:r>
+      <w:proofErr w:type="spellStart"/>
+      <w:r>
+        <w:rPr>
+          <w:lang w:val="fr-FR"/>
+        </w:rPr>
+        <w:t>viscéro</w:t>
+      </w:r>
+      <w:proofErr w:type="spellEnd"/>
+      <w:r>
+        <w:rPr>
+          <w:lang w:val="fr-FR"/>
+        </w:rPr>
+        <w:t>-somatiques</w:t>
       </w:r>
     </w:p>
     <w:p>
@@ -3175,7 +3417,21 @@
         <w:rPr>
           <w:lang w:val="fr-FR"/>
         </w:rPr>
-        <w:t>12. Relations viscéro-émotionnelles</w:t>
+        <w:t xml:space="preserve">12. Relations </w:t>
+      </w:r>
+      <w:proofErr w:type="spellStart"/>
+      <w:r>
+        <w:rPr>
+          <w:lang w:val="fr-FR"/>
+        </w:rPr>
+        <w:t>viscéro</w:t>
+      </w:r>
+      <w:proofErr w:type="spellEnd"/>
+      <w:r>
+        <w:rPr>
+          <w:lang w:val="fr-FR"/>
+        </w:rPr>
+        <w:t>-émotionnelles</w:t>
       </w:r>
     </w:p>
     <w:p>
@@ -3256,7 +3512,13 @@
         <w:rPr>
           <w:lang w:val="fr-FR"/>
         </w:rPr>
-        <w:t>13. Zones réflexes podales</w:t>
+        <w:t xml:space="preserve">13. Zones réflexes </w:t>
+      </w:r>
+      <w:r>
+        <w:rPr>
+          <w:lang w:val="fr-FR"/>
+        </w:rPr>
+        <w:t>ROP</w:t>
       </w:r>
     </w:p>
     <w:p>
@@ -3303,7 +3565,21 @@
         <w:rPr>
           <w:lang w:val="fr-FR"/>
         </w:rPr>
-        <w:t>Face plantaire du pied droit, dans le territoire du cadre duodénal. La 2e portion du duodénum, l’ampoule hépato-pancréatique de Vater et le sphincter d’Oddi peuvent être associés lorsque le contexte digestif le justifie.</w:t>
+        <w:t xml:space="preserve">Face plantaire du pied droit, dans le territoire du cadre duodénal. La 2e portion du duodénum, l’ampoule </w:t>
+      </w:r>
+      <w:proofErr w:type="spellStart"/>
+      <w:r>
+        <w:rPr>
+          <w:lang w:val="fr-FR"/>
+        </w:rPr>
+        <w:t>hépato-pancréatique</w:t>
+      </w:r>
+      <w:proofErr w:type="spellEnd"/>
+      <w:r>
+        <w:rPr>
+          <w:lang w:val="fr-FR"/>
+        </w:rPr>
+        <w:t xml:space="preserve"> de Vater et le sphincter d’Oddi peuvent être associés lorsque le contexte digestif le justifie.</w:t>
       </w:r>
     </w:p>
     <w:p>
@@ -3457,7 +3733,35 @@
         <w:rPr>
           <w:lang w:val="fr-FR"/>
         </w:rPr>
-        <w:t>• Axe hypothalamo-hypophyso-surrénalien lorsque stress et métabolisme sont concernés.</w:t>
+        <w:t xml:space="preserve">• Axe </w:t>
+      </w:r>
+      <w:proofErr w:type="spellStart"/>
+      <w:r>
+        <w:rPr>
+          <w:lang w:val="fr-FR"/>
+        </w:rPr>
+        <w:t>hypothalamo</w:t>
+      </w:r>
+      <w:proofErr w:type="spellEnd"/>
+      <w:r>
+        <w:rPr>
+          <w:lang w:val="fr-FR"/>
+        </w:rPr>
+        <w:t>-</w:t>
+      </w:r>
+      <w:proofErr w:type="spellStart"/>
+      <w:r>
+        <w:rPr>
+          <w:lang w:val="fr-FR"/>
+        </w:rPr>
+        <w:t>hypophyso</w:t>
+      </w:r>
+      <w:proofErr w:type="spellEnd"/>
+      <w:r>
+        <w:rPr>
+          <w:lang w:val="fr-FR"/>
+        </w:rPr>
+        <w:t>-surrénalien lorsque stress et métabolisme sont concernés.</w:t>
       </w:r>
     </w:p>
     <w:p>
@@ -3603,7 +3907,21 @@
         <w:rPr>
           <w:lang w:val="fr-FR"/>
         </w:rPr>
-        <w:t>• Réseaux nerveux intrapancréatiques comme interface fonctionnelle.</w:t>
+        <w:t xml:space="preserve">• Réseaux nerveux </w:t>
+      </w:r>
+      <w:proofErr w:type="spellStart"/>
+      <w:r>
+        <w:rPr>
+          <w:lang w:val="fr-FR"/>
+        </w:rPr>
+        <w:t>intrapancréatiques</w:t>
+      </w:r>
+      <w:proofErr w:type="spellEnd"/>
+      <w:r>
+        <w:rPr>
+          <w:lang w:val="fr-FR"/>
+        </w:rPr>
+        <w:t xml:space="preserve"> comme interface fonctionnelle.</w:t>
       </w:r>
     </w:p>
     <w:p>
@@ -3811,7 +4129,21 @@
         <w:rPr>
           <w:lang w:val="fr-FR"/>
         </w:rPr>
-        <w:t>• Espace rétro-péritonéal et rapports vasculaires régionaux.</w:t>
+        <w:t xml:space="preserve">• Espace </w:t>
+      </w:r>
+      <w:proofErr w:type="spellStart"/>
+      <w:r>
+        <w:rPr>
+          <w:lang w:val="fr-FR"/>
+        </w:rPr>
+        <w:t>rétro-péritonéal</w:t>
+      </w:r>
+      <w:proofErr w:type="spellEnd"/>
+      <w:r>
+        <w:rPr>
+          <w:lang w:val="fr-FR"/>
+        </w:rPr>
+        <w:t xml:space="preserve"> et rapports vasculaires régionaux.</w:t>
       </w:r>
     </w:p>
     <w:p>
@@ -3864,7 +4196,21 @@
         <w:rPr>
           <w:lang w:val="fr-FR"/>
         </w:rPr>
-        <w:t>13.5. Niveau 4 — Intégration viscéro-somatique et cerveau limbique</w:t>
+        <w:t xml:space="preserve">13.5. Niveau 4 — Intégration </w:t>
+      </w:r>
+      <w:proofErr w:type="spellStart"/>
+      <w:r>
+        <w:rPr>
+          <w:lang w:val="fr-FR"/>
+        </w:rPr>
+        <w:t>viscéro</w:t>
+      </w:r>
+      <w:proofErr w:type="spellEnd"/>
+      <w:r>
+        <w:rPr>
+          <w:lang w:val="fr-FR"/>
+        </w:rPr>
+        <w:t>-somatique et cerveau limbique</w:t>
       </w:r>
     </w:p>
     <w:p>
@@ -3878,7 +4224,23 @@
           <w:b/>
           <w:lang w:val="fr-FR"/>
         </w:rPr>
-        <w:t xml:space="preserve">Versant viscéro-somatique. </w:t>
+        <w:t xml:space="preserve">Versant </w:t>
+      </w:r>
+      <w:proofErr w:type="spellStart"/>
+      <w:r>
+        <w:rPr>
+          <w:b/>
+          <w:lang w:val="fr-FR"/>
+        </w:rPr>
+        <w:t>viscéro</w:t>
+      </w:r>
+      <w:proofErr w:type="spellEnd"/>
+      <w:r>
+        <w:rPr>
+          <w:b/>
+          <w:lang w:val="fr-FR"/>
+        </w:rPr>
+        <w:t xml:space="preserve">-somatique. </w:t>
       </w:r>
       <w:r>
         <w:rPr>
@@ -3897,7 +4259,21 @@
         <w:rPr>
           <w:lang w:val="fr-FR"/>
         </w:rPr>
-        <w:t>Les atteintes des pieds chez les personnes diabétiques ne sont pas classées ici comme relations viscéro-somatiques : elles relèvent des complications neurologiques et vasculaires du diabète.</w:t>
+        <w:t xml:space="preserve">Les atteintes des pieds chez les personnes diabétiques ne sont pas classées ici comme relations </w:t>
+      </w:r>
+      <w:proofErr w:type="spellStart"/>
+      <w:r>
+        <w:rPr>
+          <w:lang w:val="fr-FR"/>
+        </w:rPr>
+        <w:t>viscéro</w:t>
+      </w:r>
+      <w:proofErr w:type="spellEnd"/>
+      <w:r>
+        <w:rPr>
+          <w:lang w:val="fr-FR"/>
+        </w:rPr>
+        <w:t>-somatiques : elles relèvent des complications neurologiques et vasculaires du diabète.</w:t>
       </w:r>
     </w:p>
     <w:p>
@@ -4135,7 +4511,21 @@
         <w:rPr>
           <w:lang w:val="fr-FR"/>
         </w:rPr>
-        <w:t>• Séquelles anciennes d’un traumatisme abdominal après exclusion médicale : corps du pancréas + environnement rétro-péritonéal du Niveau 3 + charnière thoraco-lombaire au Niveau 4.</w:t>
+        <w:t xml:space="preserve">• Séquelles anciennes d’un traumatisme abdominal après exclusion médicale : corps du pancréas + environnement </w:t>
+      </w:r>
+      <w:proofErr w:type="spellStart"/>
+      <w:r>
+        <w:rPr>
+          <w:lang w:val="fr-FR"/>
+        </w:rPr>
+        <w:t>rétro-péritonéal</w:t>
+      </w:r>
+      <w:proofErr w:type="spellEnd"/>
+      <w:r>
+        <w:rPr>
+          <w:lang w:val="fr-FR"/>
+        </w:rPr>
+        <w:t xml:space="preserve"> du Niveau 3 + charnière thoraco-lombaire au Niveau 4.</w:t>
       </w:r>
     </w:p>
     <w:p>

</xml_diff>